<commit_message>
Align ISTM 210 reference fixture with rubric
</commit_message>
<xml_diff>
--- a/istm210/mickey/business-plan.docx
+++ b/istm210/mickey/business-plan.docx
@@ -13,6 +13,16 @@
     <w:p>
       <w:r>
         <w:t>Prepared by Mickey Mouse</w:t>
+      </w:r>
+    </w:p>
+    <w:p>
+      <w:r>
+        <w:t>Address: 100 College Avenue, College Station, Texas</w:t>
+      </w:r>
+    </w:p>
+    <w:p>
+      <w:r>
+        <w:t>Phone: 979-555-0110 | Email: test.student@example.com</w:t>
       </w:r>
     </w:p>
     <w:p>
@@ -46,6 +56,19 @@
         <w:pStyle w:val="Heading1"/>
       </w:pPr>
       <w:r>
+        <w:t>Products and services</w:t>
+      </w:r>
+    </w:p>
+    <w:p>
+      <w:r>
+        <w:t>The business provides two service packages with clear prices and scheduled delivery.</w:t>
+      </w:r>
+    </w:p>
+    <w:p>
+      <w:pPr>
+        <w:pStyle w:val="Heading1"/>
+      </w:pPr>
+      <w:r>
         <w:t>Goals</w:t>
       </w:r>
     </w:p>
@@ -71,6 +94,19 @@
       </w:pPr>
       <w:r>
         <w:t>Review prices and customer feedback at the end of every month.</w:t>
+      </w:r>
+    </w:p>
+    <w:p>
+      <w:pPr>
+        <w:pStyle w:val="Heading1"/>
+      </w:pPr>
+      <w:r>
+        <w:t>Strategy</w:t>
+      </w:r>
+    </w:p>
+    <w:p>
+      <w:r>
+        <w:t>The strategy is to start locally, track repeat customers, and improve the offer from monthly feedback.</w:t>
       </w:r>
     </w:p>
     <w:sectPr>

</xml_diff>